<commit_message>
docs: enforce LEGAVIK spelling proofing
</commit_message>
<xml_diff>
--- a/web/v2/assets/templates/LEGAVIK_Module3_位置与查找_单一平台信息_Canonical_V2.docx
+++ b/web/v2/assets/templates/LEGAVIK_Module3_位置与查找_单一平台信息_Canonical_V2.docx
@@ -9,6 +9,7 @@
       </w:pPr>
       <w:r>
         <w:rPr>
+          <w:noProof/>
           <w:color w:val="5e6b67"/>
           <w:sz w:val="19"/>
           <w:szCs w:val="19"/>
@@ -941,6 +942,7 @@
       </w:pPr>
       <w:r>
         <w:rPr>
+          <w:noProof/>
           <w:color w:val="5e6b67"/>
           <w:sz w:val="18"/>
           <w:szCs w:val="18"/>
@@ -6148,6 +6150,7 @@
       </w:pPr>
       <w:r>
         <w:rPr>
+          <w:noProof/>
           <w:color w:val="5e6b67"/>
           <w:sz w:val="18"/>
           <w:szCs w:val="18"/>
@@ -8151,6 +8154,7 @@
       </w:pPr>
       <w:r>
         <w:rPr>
+          <w:noProof/>
           <w:color w:val="5e6b67"/>
           <w:sz w:val="18"/>
           <w:szCs w:val="18"/>
@@ -10066,6 +10070,7 @@
       </w:pPr>
       <w:r>
         <w:rPr>
+          <w:noProof/>
           <w:color w:val="5e6b67"/>
           <w:sz w:val="18"/>
           <w:szCs w:val="18"/>
@@ -12121,6 +12126,7 @@
     </w:pPr>
     <w:r>
       <w:rPr>
+        <w:noProof/>
         <w:color w:val="6f7b76"/>
         <w:sz w:val="16"/>
         <w:szCs w:val="16"/>

</xml_diff>